<commit_message>
Journalspørgsmål i begge konvektionskammer-vejledninger
Begge er kvalitative og får derfor ikke Databehandling. Med-opgaver-
udgavens ene «Spørgsmål» er udbygget til otte journalspørgsmål efter
originalens to konvektionsceller. Begge får fag: Naturgeografi.

Co-Authored-By: Claude Opus 5.5 <noreply@anthropic.com>
</commit_message>
<xml_diff>
--- a/Øvelser/Geografi/konvektionskammer-med-opgaver/konvektionskammer-med-opgaver.docx
+++ b/Øvelser/Geografi/konvektionskammer-med-opgaver/konvektionskammer-med-opgaver.docx
@@ -783,13 +783,13 @@
       </w:r>
     </w:p>
     <w:bookmarkEnd w:id="30"/>
-    <w:bookmarkStart w:id="31" w:name="spørgsmål"/>
+    <w:bookmarkStart w:id="31" w:name="journalspørgsmål"/>
     <w:p>
       <w:pPr>
         <w:pStyle w:val="Heading2"/>
       </w:pPr>
       <w:r>
-        <w:t xml:space="preserve">Spørgsmål</w:t>
+        <w:t xml:space="preserve">Journalspørgsmål</w:t>
       </w:r>
     </w:p>
     <w:p>
@@ -801,7 +801,129 @@
         </w:numPr>
       </w:pPr>
       <w:r>
-        <w:t xml:space="preserve">Beskriv, hvordan et termisk lavtryk udvikles, og hvor I ser det i forsøget.</w:t>
+        <w:t xml:space="preserve">Hvad sker der med røgen, når I holder den over den kolde skorsten — og hvad sker der, hvis I i stedet holder den over den varme? Forklar hvorfor.</w:t>
+      </w:r>
+    </w:p>
+    <w:p>
+      <w:pPr>
+        <w:pStyle w:val="Compact"/>
+        <w:numPr>
+          <w:ilvl w:val="0"/>
+          <w:numId w:val="1005"/>
+        </w:numPr>
+      </w:pPr>
+      <w:r>
+        <w:t xml:space="preserve">Beskriv, hvordan et termisk lavtryk udvikles, og hvor I ser det i forsøget. Brug begreberne</w:t>
+      </w:r>
+      <w:r>
+        <w:t xml:space="preserve"> </w:t>
+      </w:r>
+      <w:r>
+        <w:rPr>
+          <w:i/>
+          <w:iCs/>
+        </w:rPr>
+        <w:t xml:space="preserve">densitet</w:t>
+      </w:r>
+      <w:r>
+        <w:t xml:space="preserve"> </w:t>
+      </w:r>
+      <w:r>
+        <w:t xml:space="preserve">og</w:t>
+      </w:r>
+      <w:r>
+        <w:t xml:space="preserve"> </w:t>
+      </w:r>
+      <w:r>
+        <w:rPr>
+          <w:i/>
+          <w:iCs/>
+        </w:rPr>
+        <w:t xml:space="preserve">opdrift</w:t>
+      </w:r>
+      <w:r>
+        <w:t xml:space="preserve">.</w:t>
+      </w:r>
+    </w:p>
+    <w:p>
+      <w:pPr>
+        <w:pStyle w:val="Compact"/>
+        <w:numPr>
+          <w:ilvl w:val="0"/>
+          <w:numId w:val="1005"/>
+        </w:numPr>
+      </w:pPr>
+      <w:r>
+        <w:t xml:space="preserve">Beskriv tilsvarende, hvordan et termisk højtryk udvikles, og hvor I ser det i forsøget.</w:t>
+      </w:r>
+    </w:p>
+    <w:p>
+      <w:pPr>
+        <w:pStyle w:val="Compact"/>
+        <w:numPr>
+          <w:ilvl w:val="0"/>
+          <w:numId w:val="1005"/>
+        </w:numPr>
+      </w:pPr>
+      <w:r>
+        <w:t xml:space="preserve">Vind blæser fra højtryk mod lavtryk. Hvor i kammeret ser I vinden ved</w:t>
+      </w:r>
+      <w:r>
+        <w:t xml:space="preserve"> </w:t>
+      </w:r>
+      <w:r>
+        <w:t xml:space="preserve">“jordoverfladen”</w:t>
+      </w:r>
+      <w:r>
+        <w:t xml:space="preserve">, og hvor ser I returstrømmen i højden?</w:t>
+      </w:r>
+    </w:p>
+    <w:p>
+      <w:pPr>
+        <w:pStyle w:val="Compact"/>
+        <w:numPr>
+          <w:ilvl w:val="0"/>
+          <w:numId w:val="1005"/>
+        </w:numPr>
+      </w:pPr>
+      <w:r>
+        <w:t xml:space="preserve">Forestil jer, at den varme skorsten er ækvator, og den kolde er området omkring 30° N. Hvilken del af den globale cirkulation har I så bygget en model af, og i hvilken retning vil I forvente, at vindene ved jordoverfladen blæser omkring ækvator?</w:t>
+      </w:r>
+    </w:p>
+    <w:p>
+      <w:pPr>
+        <w:pStyle w:val="Compact"/>
+        <w:numPr>
+          <w:ilvl w:val="0"/>
+          <w:numId w:val="1005"/>
+        </w:numPr>
+      </w:pPr>
+      <w:r>
+        <w:t xml:space="preserve">I kammeret blæser det i en lige linje fra højtryk til lavtryk. Hvorfor afbøjes vindene på Jorden — fx passaten — i stedet?</w:t>
+      </w:r>
+    </w:p>
+    <w:p>
+      <w:pPr>
+        <w:pStyle w:val="Compact"/>
+        <w:numPr>
+          <w:ilvl w:val="0"/>
+          <w:numId w:val="1005"/>
+        </w:numPr>
+      </w:pPr>
+      <w:r>
+        <w:t xml:space="preserve">Hvordan er klimaet og plantebælterne omkring ækvator og omkring vendekredsene, og hvordan hænger det sammen med, om luften stiger eller synker de to steder?</w:t>
+      </w:r>
+    </w:p>
+    <w:p>
+      <w:pPr>
+        <w:pStyle w:val="Compact"/>
+        <w:numPr>
+          <w:ilvl w:val="0"/>
+          <w:numId w:val="1005"/>
+        </w:numPr>
+      </w:pPr>
+      <w:r>
+        <w:t xml:space="preserve">Nævn mindst én forenkling i forsøget, som gør, at modellen ikke svarer helt til den virkelige atmosfære.</w:t>
       </w:r>
     </w:p>
     <w:bookmarkEnd w:id="31"/>
@@ -936,7 +1058,7 @@
         <w:sz w:val="16"/>
         <w:szCs w:val="16"/>
       </w:rPr>
-      <w:t xml:space="preserve"/>
+      <w:t xml:space="preserve">NATURGEOGRAFI</w:t>
     </w:r>
     <w:r>
       <w:rPr>

</xml_diff>